<commit_message>
perbaiki template temuan negatif dan positif
</commit_message>
<xml_diff>
--- a/storage/app/public/template/template_laporan.docx
+++ b/storage/app/public/template/template_laporan.docx
@@ -366,6 +366,7 @@
                 <w:szCs w:val="20"/>
               </w:rPr>
             </w:pPr>
+            <w:proofErr w:type="spellStart"/>
             <w:r>
               <w:rPr>
                 <w:rFonts w:ascii="Arial" w:hAnsi="Arial" w:cs="Arial"/>
@@ -374,7 +375,18 @@
                 <w:sz w:val="20"/>
                 <w:szCs w:val="20"/>
               </w:rPr>
-              <w:t xml:space="preserve">Tanggal </w:t>
+              <w:t>Tanggal</w:t>
+            </w:r>
+            <w:proofErr w:type="spellEnd"/>
+            <w:r>
+              <w:rPr>
+                <w:rFonts w:ascii="Arial" w:hAnsi="Arial" w:cs="Arial"/>
+                <w:b/>
+                <w:bCs/>
+                <w:sz w:val="20"/>
+                <w:szCs w:val="20"/>
+              </w:rPr>
+              <w:t xml:space="preserve"> </w:t>
             </w:r>
             <w:r>
               <w:rPr>
@@ -441,7 +453,29 @@
                 <w:sz w:val="20"/>
                 <w:szCs w:val="20"/>
               </w:rPr>
-              <w:t>Prodi/Fakultas/Unit</w:t>
+              <w:t>Prodi/</w:t>
+            </w:r>
+            <w:proofErr w:type="spellStart"/>
+            <w:r>
+              <w:rPr>
+                <w:rFonts w:ascii="Arial" w:hAnsi="Arial" w:cs="Arial"/>
+                <w:b/>
+                <w:bCs/>
+                <w:sz w:val="20"/>
+                <w:szCs w:val="20"/>
+              </w:rPr>
+              <w:t>Fakultas</w:t>
+            </w:r>
+            <w:proofErr w:type="spellEnd"/>
+            <w:r>
+              <w:rPr>
+                <w:rFonts w:ascii="Arial" w:hAnsi="Arial" w:cs="Arial"/>
+                <w:b/>
+                <w:bCs/>
+                <w:sz w:val="20"/>
+                <w:szCs w:val="20"/>
+              </w:rPr>
+              <w:t>/Unit</w:t>
             </w:r>
           </w:p>
         </w:tc>
@@ -491,6 +525,7 @@
                 <w:szCs w:val="20"/>
               </w:rPr>
             </w:pPr>
+            <w:proofErr w:type="spellStart"/>
             <w:r>
               <w:rPr>
                 <w:rFonts w:ascii="Arial" w:hAnsi="Arial" w:cs="Arial"/>
@@ -513,6 +548,7 @@
               </w:rPr>
               <w:t>an</w:t>
             </w:r>
+            <w:proofErr w:type="spellEnd"/>
           </w:p>
         </w:tc>
         <w:tc>
@@ -845,6 +881,7 @@
                 <w:szCs w:val="20"/>
               </w:rPr>
             </w:pPr>
+            <w:proofErr w:type="spellStart"/>
             <w:r>
               <w:rPr>
                 <w:rFonts w:ascii="Arial" w:hAnsi="Arial" w:cs="Arial"/>
@@ -854,6 +891,7 @@
               </w:rPr>
               <w:t>Kelebihan</w:t>
             </w:r>
+            <w:proofErr w:type="spellEnd"/>
           </w:p>
         </w:tc>
         <w:tc>
@@ -883,8 +921,20 @@
                 <w:sz w:val="20"/>
                 <w:szCs w:val="20"/>
               </w:rPr>
-              <w:t>Ruang Peningkatan</w:t>
-            </w:r>
+              <w:t xml:space="preserve">Ruang </w:t>
+            </w:r>
+            <w:proofErr w:type="spellStart"/>
+            <w:r>
+              <w:rPr>
+                <w:rFonts w:ascii="Arial" w:hAnsi="Arial" w:cs="Arial"/>
+                <w:b/>
+                <w:iCs/>
+                <w:sz w:val="20"/>
+                <w:szCs w:val="20"/>
+              </w:rPr>
+              <w:t>Peningkatan</w:t>
+            </w:r>
+            <w:proofErr w:type="spellEnd"/>
           </w:p>
         </w:tc>
       </w:tr>
@@ -988,7 +1038,25 @@
                 <w:sz w:val="20"/>
                 <w:szCs w:val="20"/>
               </w:rPr>
-              <w:t>${kelebihan}</w:t>
+              <w:t>${</w:t>
+            </w:r>
+            <w:proofErr w:type="spellStart"/>
+            <w:r>
+              <w:rPr>
+                <w:rFonts w:ascii="Arial" w:hAnsi="Arial" w:cs="Arial"/>
+                <w:sz w:val="20"/>
+                <w:szCs w:val="20"/>
+              </w:rPr>
+              <w:t>kelebihan</w:t>
+            </w:r>
+            <w:proofErr w:type="spellEnd"/>
+            <w:r>
+              <w:rPr>
+                <w:rFonts w:ascii="Arial" w:hAnsi="Arial" w:cs="Arial"/>
+                <w:sz w:val="20"/>
+                <w:szCs w:val="20"/>
+              </w:rPr>
+              <w:t>}</w:t>
             </w:r>
           </w:p>
         </w:tc>
@@ -1011,426 +1079,30 @@
                 <w:sz w:val="20"/>
                 <w:szCs w:val="20"/>
               </w:rPr>
-              <w:t>${ruang}</w:t>
+              <w:t>${</w:t>
+            </w:r>
+            <w:proofErr w:type="spellStart"/>
+            <w:r>
+              <w:rPr>
+                <w:rFonts w:ascii="Arial" w:hAnsi="Arial" w:cs="Arial"/>
+                <w:sz w:val="20"/>
+                <w:szCs w:val="20"/>
+              </w:rPr>
+              <w:t>ruang</w:t>
+            </w:r>
+            <w:proofErr w:type="spellEnd"/>
+            <w:r>
+              <w:rPr>
+                <w:rFonts w:ascii="Arial" w:hAnsi="Arial" w:cs="Arial"/>
+                <w:sz w:val="20"/>
+                <w:szCs w:val="20"/>
+              </w:rPr>
+              <w:t>}</w:t>
             </w:r>
           </w:p>
         </w:tc>
       </w:tr>
     </w:tbl>
-    <w:p>
-      <w:pPr>
-        <w:spacing w:before="240" w:after="0" w:line="240" w:lineRule="auto"/>
-        <w:ind w:hanging="426"/>
-        <w:rPr>
-          <w:rFonts w:ascii="Arial" w:hAnsi="Arial" w:cs="Arial"/>
-          <w:b/>
-        </w:rPr>
-      </w:pPr>
-      <w:r>
-        <w:rPr>
-          <w:rFonts w:ascii="Arial" w:hAnsi="Arial" w:cs="Arial"/>
-          <w:b/>
-          <w:lang w:val="en-US"/>
-        </w:rPr>
-        <w:t xml:space="preserve">RINGKASAN TEMUAN AUDIT   </w:t>
-      </w:r>
-    </w:p>
-    <w:tbl>
-      <w:tblPr>
-        <w:tblW w:w="10065" w:type="dxa"/>
-        <w:tblInd w:w="-431" w:type="dxa"/>
-        <w:tblBorders>
-          <w:top w:val="single" w:sz="4" w:space="0" w:color="000000"/>
-          <w:left w:val="single" w:sz="4" w:space="0" w:color="000000"/>
-          <w:bottom w:val="single" w:sz="4" w:space="0" w:color="000000"/>
-          <w:right w:val="single" w:sz="4" w:space="0" w:color="000000"/>
-          <w:insideH w:val="single" w:sz="4" w:space="0" w:color="000000"/>
-          <w:insideV w:val="single" w:sz="4" w:space="0" w:color="000000"/>
-        </w:tblBorders>
-        <w:tblLayout w:type="fixed"/>
-        <w:tblLook w:val="04A0" w:firstRow="1" w:lastRow="0" w:firstColumn="1" w:lastColumn="0" w:noHBand="0" w:noVBand="1"/>
-      </w:tblPr>
-      <w:tblGrid>
-        <w:gridCol w:w="658"/>
-        <w:gridCol w:w="6005"/>
-        <w:gridCol w:w="1134"/>
-        <w:gridCol w:w="1134"/>
-        <w:gridCol w:w="1134"/>
-      </w:tblGrid>
-      <w:tr>
-        <w:tc>
-          <w:tcPr>
-            <w:tcW w:w="658" w:type="dxa"/>
-            <w:vMerge w:val="restart"/>
-            <w:shd w:val="clear" w:color="auto" w:fill="BDD6EE" w:themeFill="accent1" w:themeFillTint="66"/>
-            <w:vAlign w:val="center"/>
-          </w:tcPr>
-          <w:p>
-            <w:pPr>
-              <w:spacing w:after="0" w:line="240" w:lineRule="auto"/>
-              <w:jc w:val="center"/>
-              <w:rPr>
-                <w:rFonts w:ascii="Arial" w:hAnsi="Arial" w:cs="Arial"/>
-                <w:b/>
-                <w:iCs/>
-                <w:sz w:val="20"/>
-                <w:szCs w:val="20"/>
-              </w:rPr>
-            </w:pPr>
-            <w:r>
-              <w:rPr>
-                <w:rFonts w:ascii="Arial" w:hAnsi="Arial" w:cs="Arial"/>
-                <w:b/>
-                <w:iCs/>
-                <w:sz w:val="20"/>
-                <w:szCs w:val="20"/>
-              </w:rPr>
-              <w:t>No</w:t>
-            </w:r>
-          </w:p>
-        </w:tc>
-        <w:tc>
-          <w:tcPr>
-            <w:tcW w:w="6005" w:type="dxa"/>
-            <w:vMerge w:val="restart"/>
-            <w:shd w:val="clear" w:color="auto" w:fill="BDD6EE" w:themeFill="accent1" w:themeFillTint="66"/>
-            <w:vAlign w:val="center"/>
-          </w:tcPr>
-          <w:p>
-            <w:pPr>
-              <w:spacing w:after="0" w:line="240" w:lineRule="auto"/>
-              <w:jc w:val="center"/>
-              <w:rPr>
-                <w:rFonts w:ascii="Arial" w:hAnsi="Arial" w:cs="Arial"/>
-                <w:b/>
-                <w:iCs/>
-                <w:sz w:val="20"/>
-                <w:szCs w:val="20"/>
-              </w:rPr>
-            </w:pPr>
-            <w:r>
-              <w:rPr>
-                <w:rFonts w:ascii="Arial" w:hAnsi="Arial" w:cs="Arial"/>
-                <w:b/>
-                <w:sz w:val="20"/>
-                <w:szCs w:val="20"/>
-              </w:rPr>
-              <w:t>Deskripsi / Uraian Temuan</w:t>
-            </w:r>
-          </w:p>
-        </w:tc>
-        <w:tc>
-          <w:tcPr>
-            <w:tcW w:w="3402" w:type="dxa"/>
-            <w:gridSpan w:val="3"/>
-            <w:shd w:val="clear" w:color="auto" w:fill="BDD6EE" w:themeFill="accent1" w:themeFillTint="66"/>
-            <w:vAlign w:val="center"/>
-          </w:tcPr>
-          <w:p>
-            <w:pPr>
-              <w:spacing w:after="0" w:line="240" w:lineRule="auto"/>
-              <w:jc w:val="center"/>
-              <w:rPr>
-                <w:rFonts w:ascii="Arial" w:hAnsi="Arial" w:cs="Arial"/>
-                <w:b/>
-                <w:iCs/>
-                <w:sz w:val="20"/>
-                <w:szCs w:val="20"/>
-              </w:rPr>
-            </w:pPr>
-            <w:r>
-              <w:rPr>
-                <w:rFonts w:ascii="Arial" w:hAnsi="Arial" w:cs="Arial"/>
-                <w:b/>
-                <w:iCs/>
-                <w:sz w:val="20"/>
-                <w:szCs w:val="20"/>
-              </w:rPr>
-              <w:t xml:space="preserve">Kategori Temuan </w:t>
-            </w:r>
-          </w:p>
-        </w:tc>
-      </w:tr>
-      <w:tr>
-        <w:tc>
-          <w:tcPr>
-            <w:tcW w:w="658" w:type="dxa"/>
-            <w:vMerge/>
-          </w:tcPr>
-          <w:p>
-            <w:pPr>
-              <w:spacing w:after="0" w:line="240" w:lineRule="auto"/>
-              <w:rPr>
-                <w:rFonts w:ascii="Arial" w:hAnsi="Arial" w:cs="Arial"/>
-                <w:sz w:val="20"/>
-                <w:szCs w:val="20"/>
-              </w:rPr>
-            </w:pPr>
-          </w:p>
-        </w:tc>
-        <w:tc>
-          <w:tcPr>
-            <w:tcW w:w="6005" w:type="dxa"/>
-            <w:vMerge/>
-          </w:tcPr>
-          <w:p>
-            <w:pPr>
-              <w:spacing w:after="0" w:line="240" w:lineRule="auto"/>
-              <w:rPr>
-                <w:rFonts w:ascii="Arial" w:hAnsi="Arial" w:cs="Arial"/>
-                <w:sz w:val="20"/>
-                <w:szCs w:val="20"/>
-              </w:rPr>
-            </w:pPr>
-          </w:p>
-        </w:tc>
-        <w:tc>
-          <w:tcPr>
-            <w:tcW w:w="1134" w:type="dxa"/>
-            <w:shd w:val="clear" w:color="auto" w:fill="BDD6EE" w:themeFill="accent1" w:themeFillTint="66"/>
-            <w:vAlign w:val="center"/>
-          </w:tcPr>
-          <w:p>
-            <w:pPr>
-              <w:spacing w:after="0" w:line="240" w:lineRule="auto"/>
-              <w:ind w:left="-105" w:right="-76"/>
-              <w:jc w:val="center"/>
-              <w:rPr>
-                <w:rFonts w:ascii="Arial" w:hAnsi="Arial" w:cs="Arial"/>
-                <w:b/>
-                <w:bCs/>
-                <w:sz w:val="20"/>
-                <w:szCs w:val="20"/>
-              </w:rPr>
-            </w:pPr>
-            <w:r>
-              <w:rPr>
-                <w:rFonts w:ascii="Arial" w:hAnsi="Arial" w:cs="Arial"/>
-                <w:b/>
-                <w:bCs/>
-                <w:sz w:val="20"/>
-                <w:szCs w:val="20"/>
-              </w:rPr>
-              <w:t>Observasi</w:t>
-            </w:r>
-          </w:p>
-        </w:tc>
-        <w:tc>
-          <w:tcPr>
-            <w:tcW w:w="1134" w:type="dxa"/>
-            <w:shd w:val="clear" w:color="auto" w:fill="BDD6EE" w:themeFill="accent1" w:themeFillTint="66"/>
-            <w:vAlign w:val="center"/>
-          </w:tcPr>
-          <w:p>
-            <w:pPr>
-              <w:spacing w:after="0" w:line="240" w:lineRule="auto"/>
-              <w:jc w:val="center"/>
-              <w:rPr>
-                <w:rFonts w:ascii="Arial" w:hAnsi="Arial" w:cs="Arial"/>
-                <w:b/>
-                <w:bCs/>
-                <w:sz w:val="20"/>
-                <w:szCs w:val="20"/>
-                <w:lang w:val="en-US"/>
-              </w:rPr>
-            </w:pPr>
-            <w:r>
-              <w:rPr>
-                <w:rFonts w:ascii="Arial" w:hAnsi="Arial" w:cs="Arial"/>
-                <w:b/>
-                <w:bCs/>
-                <w:sz w:val="20"/>
-                <w:szCs w:val="20"/>
-              </w:rPr>
-              <w:t>KTS Minor</w:t>
-            </w:r>
-          </w:p>
-        </w:tc>
-        <w:tc>
-          <w:tcPr>
-            <w:tcW w:w="1134" w:type="dxa"/>
-            <w:shd w:val="clear" w:color="auto" w:fill="BDD6EE" w:themeFill="accent1" w:themeFillTint="66"/>
-            <w:vAlign w:val="center"/>
-          </w:tcPr>
-          <w:p>
-            <w:pPr>
-              <w:spacing w:after="0" w:line="240" w:lineRule="auto"/>
-              <w:jc w:val="center"/>
-              <w:rPr>
-                <w:rFonts w:ascii="Arial" w:hAnsi="Arial" w:cs="Arial"/>
-                <w:b/>
-                <w:bCs/>
-                <w:sz w:val="20"/>
-                <w:szCs w:val="20"/>
-              </w:rPr>
-            </w:pPr>
-            <w:r>
-              <w:rPr>
-                <w:rFonts w:ascii="Arial" w:hAnsi="Arial" w:cs="Arial"/>
-                <w:b/>
-                <w:bCs/>
-                <w:sz w:val="20"/>
-                <w:szCs w:val="20"/>
-              </w:rPr>
-              <w:t>KTS Mayor</w:t>
-            </w:r>
-          </w:p>
-        </w:tc>
-      </w:tr>
-      <w:tr>
-        <w:tc>
-          <w:tcPr>
-            <w:tcW w:w="658" w:type="dxa"/>
-          </w:tcPr>
-          <w:p>
-            <w:pPr>
-              <w:spacing w:after="0" w:line="240" w:lineRule="auto"/>
-              <w:jc w:val="center"/>
-              <w:rPr>
-                <w:rFonts w:ascii="Arial" w:hAnsi="Arial" w:cs="Arial"/>
-                <w:sz w:val="20"/>
-                <w:szCs w:val="20"/>
-              </w:rPr>
-            </w:pPr>
-            <w:r>
-              <w:rPr>
-                <w:rFonts w:ascii="Arial" w:hAnsi="Arial" w:cs="Arial"/>
-                <w:sz w:val="20"/>
-                <w:szCs w:val="20"/>
-              </w:rPr>
-              <w:t>${noTemuan}</w:t>
-            </w:r>
-          </w:p>
-        </w:tc>
-        <w:tc>
-          <w:tcPr>
-            <w:tcW w:w="6005" w:type="dxa"/>
-          </w:tcPr>
-          <w:p>
-            <w:pPr>
-              <w:spacing w:after="0" w:line="240" w:lineRule="auto"/>
-              <w:rPr>
-                <w:rFonts w:ascii="Arial" w:hAnsi="Arial" w:cs="Arial"/>
-                <w:sz w:val="20"/>
-                <w:szCs w:val="20"/>
-              </w:rPr>
-            </w:pPr>
-            <w:r>
-              <w:rPr>
-                <w:rFonts w:ascii="Arial" w:hAnsi="Arial" w:cs="Arial"/>
-                <w:sz w:val="20"/>
-                <w:szCs w:val="20"/>
-              </w:rPr>
-              <w:t>${temuan}</w:t>
-            </w:r>
-          </w:p>
-        </w:tc>
-        <w:tc>
-          <w:tcPr>
-            <w:tcW w:w="1134" w:type="dxa"/>
-            <w:vAlign w:val="center"/>
-          </w:tcPr>
-          <w:p>
-            <w:pPr>
-              <w:spacing w:after="0" w:line="240" w:lineRule="auto"/>
-              <w:jc w:val="center"/>
-              <w:rPr>
-                <w:rFonts w:ascii="Arial" w:hAnsi="Arial" w:cs="Arial"/>
-                <w:sz w:val="20"/>
-                <w:szCs w:val="20"/>
-              </w:rPr>
-            </w:pPr>
-            <w:r>
-              <w:rPr>
-                <w:rFonts w:ascii="Arial" w:hAnsi="Arial" w:cs="Arial"/>
-                <w:sz w:val="20"/>
-                <w:szCs w:val="20"/>
-              </w:rPr>
-              <w:t>${observasi}</w:t>
-            </w:r>
-          </w:p>
-        </w:tc>
-        <w:tc>
-          <w:tcPr>
-            <w:tcW w:w="1134" w:type="dxa"/>
-            <w:shd w:val="clear" w:color="auto" w:fill="auto"/>
-            <w:vAlign w:val="center"/>
-          </w:tcPr>
-          <w:p>
-            <w:pPr>
-              <w:spacing w:after="0" w:line="240" w:lineRule="auto"/>
-              <w:jc w:val="center"/>
-              <w:rPr>
-                <w:rFonts w:ascii="Arial" w:hAnsi="Arial" w:cs="Arial"/>
-                <w:sz w:val="20"/>
-                <w:szCs w:val="20"/>
-              </w:rPr>
-            </w:pPr>
-            <w:r>
-              <w:rPr>
-                <w:rFonts w:ascii="Arial" w:hAnsi="Arial" w:cs="Arial"/>
-                <w:sz w:val="20"/>
-                <w:szCs w:val="20"/>
-              </w:rPr>
-              <w:t>${minor}</w:t>
-            </w:r>
-          </w:p>
-        </w:tc>
-        <w:tc>
-          <w:tcPr>
-            <w:tcW w:w="1134" w:type="dxa"/>
-            <w:shd w:val="clear" w:color="auto" w:fill="auto"/>
-            <w:vAlign w:val="center"/>
-          </w:tcPr>
-          <w:p>
-            <w:pPr>
-              <w:spacing w:after="0" w:line="240" w:lineRule="auto"/>
-              <w:jc w:val="center"/>
-              <w:rPr>
-                <w:rFonts w:ascii="Arial" w:hAnsi="Arial" w:cs="Arial"/>
-                <w:sz w:val="20"/>
-                <w:szCs w:val="20"/>
-              </w:rPr>
-            </w:pPr>
-            <w:r>
-              <w:rPr>
-                <w:rFonts w:ascii="Arial" w:hAnsi="Arial" w:cs="Arial"/>
-                <w:sz w:val="20"/>
-                <w:szCs w:val="20"/>
-              </w:rPr>
-              <w:t>${mayor}</w:t>
-            </w:r>
-          </w:p>
-        </w:tc>
-      </w:tr>
-    </w:tbl>
-    <w:p>
-      <w:pPr>
-        <w:spacing w:before="240" w:after="0" w:line="240" w:lineRule="auto"/>
-        <w:ind w:hanging="426"/>
-        <w:rPr>
-          <w:rFonts w:ascii="Arial" w:hAnsi="Arial" w:cs="Arial"/>
-          <w:b/>
-        </w:rPr>
-      </w:pPr>
-      <w:r>
-        <w:rPr>
-          <w:rFonts w:ascii="Arial" w:hAnsi="Arial" w:cs="Arial"/>
-          <w:b/>
-        </w:rPr>
-        <w:t xml:space="preserve">KESIMPULAN </w:t>
-      </w:r>
-    </w:p>
-    <w:p>
-      <w:pPr>
-        <w:spacing w:before="240" w:after="0" w:line="240" w:lineRule="auto"/>
-        <w:ind w:hanging="426"/>
-        <w:rPr>
-          <w:rFonts w:ascii="Arial" w:hAnsi="Arial" w:cs="Arial"/>
-          <w:b/>
-        </w:rPr>
-      </w:pPr>
-    </w:p>
     <w:p>
       <w:pPr>
         <w:spacing w:before="240" w:after="0" w:line="240" w:lineRule="auto"/>

</xml_diff>